<commit_message>
Tapestry: every customer document now says Coach is the launch brand
Mandeep changed the launch brand from Kate Spade to Coach. The decision was
recorded as settled, but the documents the customer holds still said Kate
Spade, and that is where it kept coming back from. Updated: the
Implementation Plan in three places, Doc 1 section 17 in two, and the v8
appendix's launch-brand field, filled as a tracked change. Ledger B3 closes.

Co-Authored-By: Claude Fable 5.1 <noreply@anthropic.com>
Claude-Session: https://claude.ai/code/session_01BUMjKwPUp3aUvfys6s5Jmi
</commit_message>
<xml_diff>
--- a/docs/opticon/Tapestry_Scope_of_Services_v8_tracked.docx
+++ b/docs/opticon/Tapestry_Scope_of_Services_v8_tracked.docx
@@ -3214,15 +3214,28 @@
       <w:pPr>
         <w:spacing w:after="0"/>
       </w:pPr>
-      <w:r>
-        <w:rPr>
-          <w:rFonts w:ascii="Arial" w:hAnsi="Arial"/>
-          <w:i/>
-          <w:color w:val="5A6472"/>
-          <w:sz w:val="18"/>
-        </w:rPr>
-        <w:t>Field to complete before issue: launch brand.</w:t>
-      </w:r>
+      <w:del w:id="9001" w:author="Optimizely Delivery" w:date="2026-09-02T00:00:00Z">
+        <w:r>
+          <w:rPr>
+            <w:rFonts w:ascii="Arial" w:hAnsi="Arial"/>
+            <w:i/>
+            <w:color w:val="5A6472"/>
+            <w:sz w:val="18"/>
+          </w:rPr>
+          <w:delText xml:space="preserve">Field to complete before issue: launch brand.</w:delText>
+        </w:r>
+      </w:del>
+      <w:ins w:id="9002" w:author="Optimizely Delivery" w:date="2026-09-02T00:00:00Z">
+        <w:r>
+          <w:rPr>
+            <w:rFonts w:ascii="Arial" w:hAnsi="Arial"/>
+            <w:i/>
+            <w:color w:val="5A6472"/>
+            <w:sz w:val="18"/>
+          </w:rPr>
+          <w:t xml:space="preserve">Launch brand: Coach.</w:t>
+        </w:r>
+      </w:ins>
     </w:p>
     <w:sectPr>
       <w:pgSz w:w="12240" w:h="15840"/>

</xml_diff>